<commit_message>
Panneau .docx : notes en bas de page, en-tête, pied de page et figures, modifiables et insérables
Co-Authored-By: Claude Opus 5.5 (1M context) <noreply@anthropic.com>
Claude-Session: https://claude.ai/code/session_015DkpXcmejfJypKdKFKvmBa
</commit_message>
<xml_diff>
--- a/gallery/tests/e2e/fixtures/christophe.docx
+++ b/gallery/tests/e2e/fixtures/christophe.docx
@@ -330,6 +330,8 @@
       </w:r>
     </w:p>
     <w:sectPr>
+      <w:headerReference w:type="default" r:id="rId7"/>
+      <w:footerReference w:type="default" r:id="rId8"/>
       <w:footnotePr>
         <w:numFmt w:val="decimal"/>
       </w:footnotePr>
@@ -385,6 +387,34 @@
 </w15:commentsEx>
 </file>
 
+<file path=word/footer1.xml><?xml version="1.0" encoding="utf-8"?>
+<w:ftr xmlns:w="http://schemas.openxmlformats.org/wordprocessingml/2006/main" xmlns:r="http://schemas.openxmlformats.org/officeDocument/2006/relationships" xmlns:w14="http://schemas.microsoft.com/office/word/2010/wordml">
+  <w:p>
+    <w:pPr>
+      <w:jc w:val="center"/>
+    </w:pPr>
+    <w:r>
+      <w:t xml:space="preserve">Page </w:t>
+    </w:r>
+    <w:r>
+      <w:fldChar w:fldCharType="begin"/>
+    </w:r>
+    <w:r>
+      <w:instrText xml:space="preserve"> PAGE </w:instrText>
+    </w:r>
+    <w:r>
+      <w:fldChar w:fldCharType="separate"/>
+    </w:r>
+    <w:r>
+      <w:t>12</w:t>
+    </w:r>
+    <w:r>
+      <w:fldChar w:fldCharType="end"/>
+    </w:r>
+  </w:p>
+</w:ftr>
+</file>
+
 <file path=word/footnotes.xml><?xml version="1.0" encoding="utf-8"?>
 <w:footnotes xmlns:w="http://schemas.openxmlformats.org/wordprocessingml/2006/main">
   <w:footnote w:type="separator" w:id="-1">
@@ -426,6 +456,20 @@
     </w:p>
   </w:footnote>
 </w:footnotes>
+</file>
+
+<file path=word/header1.xml><?xml version="1.0" encoding="utf-8"?>
+<w:hdr xmlns:w="http://schemas.openxmlformats.org/wordprocessingml/2006/main" xmlns:r="http://schemas.openxmlformats.org/officeDocument/2006/relationships" xmlns:w14="http://schemas.microsoft.com/office/word/2010/wordml">
+  <w:p>
+    <w:pPr>
+      <w:pStyle w:val="En-tte"/>
+      <w:jc w:val="right"/>
+    </w:pPr>
+    <w:r>
+      <w:t>Chapitre 2 – Albédo des glaciers tropicaux</w:t>
+    </w:r>
+  </w:p>
+</w:hdr>
 </file>
 
 <file path=word/styles.xml><?xml version="1.0" encoding="utf-8"?>

</xml_diff>

<commit_message>
docx : page rendue comme Word (styles, marges, interligne, numéros de ligne) à l'échelle du panneau
Co-Authored-By: Claude Opus 5.5 (1M context) <noreply@anthropic.com>
Claude-Session: https://claude.ai/code/session_015DkpXcmejfJypKdKFKvmBa
</commit_message>
<xml_diff>
--- a/gallery/tests/e2e/fixtures/christophe.docx
+++ b/gallery/tests/e2e/fixtures/christophe.docx
@@ -337,6 +337,7 @@
       </w:footnotePr>
       <w:pgSz w:w="12240" w:h="15840"/>
       <w:pgMar w:top="1440" w:right="1440" w:bottom="1440" w:left="1440" w:header="708" w:footer="708" w:gutter="0"/>
+      <w:lnNumType w:countBy="1" w:restart="continuous"/>
       <w:cols w:space="708"/>
     </w:sectPr>
   </w:body>
@@ -486,6 +487,9 @@
   <w:style w:type="paragraph" w:default="1" w:styleId="Normal">
     <w:name w:val="Normal"/>
     <w:qFormat/>
+    <w:pPr>
+      <w:spacing w:after="120" w:line="360" w:lineRule="auto"/>
+    </w:pPr>
   </w:style>
   <w:style w:type="paragraph" w:styleId="Titre1">
     <w:name w:val="heading 1"/>

</xml_diff>